<commit_message>
Modification de la verif du scan
</commit_message>
<xml_diff>
--- a/MEMOIRE/Fiche_d'autorisation_de_depôt_de_mémoire_aya_moussa.docx
+++ b/MEMOIRE/Fiche_d'autorisation_de_depôt_de_mémoire_aya_moussa.docx
@@ -1,6 +1,6 @@
 
 <file path=word/document.xml><?xml version="1.0" encoding="utf-8"?>
-<w:document xmlns:wpc="http://schemas.microsoft.com/office/word/2010/wordprocessingCanvas" xmlns:cx="http://schemas.microsoft.com/office/drawing/2014/chartex" xmlns:cx1="http://schemas.microsoft.com/office/drawing/2015/9/8/chartex" xmlns:cx2="http://schemas.microsoft.com/office/drawing/2015/10/21/chartex" xmlns:cx3="http://schemas.microsoft.com/office/drawing/2016/5/9/chartex" xmlns:cx4="http://schemas.microsoft.com/office/drawing/2016/5/10/chartex" xmlns:cx5="http://schemas.microsoft.com/office/drawing/2016/5/11/chartex" xmlns:cx6="http://schemas.microsoft.com/office/drawing/2016/5/12/chartex" xmlns:cx7="http://schemas.microsoft.com/office/drawing/2016/5/13/chartex" xmlns:cx8="http://schemas.microsoft.com/office/drawing/2016/5/14/chartex" xmlns:mc="http://schemas.openxmlformats.org/markup-compatibility/2006" xmlns:aink="http://schemas.microsoft.com/office/drawing/2016/ink" xmlns:am3d="http://schemas.microsoft.com/office/drawing/2017/model3d" xmlns:o="urn:schemas-microsoft-com:office:office" xmlns:oel="http://schemas.microsoft.com/office/2019/extlst" xmlns:r="http://schemas.openxmlformats.org/officeDocument/2006/relationships" xmlns:m="http://schemas.openxmlformats.org/officeDocument/2006/math" xmlns:v="urn:schemas-microsoft-com:vml" xmlns:wp14="http://schemas.microsoft.com/office/word/2010/wordprocessingDrawing" xmlns:wp="http://schemas.openxmlformats.org/drawingml/2006/wordprocessingDrawing" xmlns:w10="urn:schemas-microsoft-com:office:word" xmlns:w="http://schemas.openxmlformats.org/wordprocessingml/2006/main" xmlns:w14="http://schemas.microsoft.com/office/word/2010/wordml" xmlns:w15="http://schemas.microsoft.com/office/word/2012/wordml" xmlns:w16cex="http://schemas.microsoft.com/office/word/2018/wordml/cex" xmlns:w16cid="http://schemas.microsoft.com/office/word/2016/wordml/cid" xmlns:w16="http://schemas.microsoft.com/office/word/2018/wordml" xmlns:w16du="http://schemas.microsoft.com/office/word/2023/wordml/word16du" xmlns:w16sdtdh="http://schemas.microsoft.com/office/word/2020/wordml/sdtdatahash" xmlns:w16sdtfl="http://schemas.microsoft.com/office/word/2024/wordml/sdtformatlock" xmlns:w16se="http://schemas.microsoft.com/office/word/2015/wordml/symex" xmlns:wpg="http://schemas.microsoft.com/office/word/2010/wordprocessingGroup" xmlns:wpi="http://schemas.microsoft.com/office/word/2010/wordprocessingInk" xmlns:wne="http://schemas.microsoft.com/office/word/2006/wordml" xmlns:wps="http://schemas.microsoft.com/office/word/2010/wordprocessingShape" mc:Ignorable="w14 w15 w16se w16cid w16 w16cex w16sdtdh w16sdtfl w16du wp14">
+<w:document xmlns:wpc="http://schemas.microsoft.com/office/word/2010/wordprocessingCanvas" xmlns:cx="http://schemas.microsoft.com/office/drawing/2014/chartex" xmlns:cx1="http://schemas.microsoft.com/office/drawing/2015/9/8/chartex" xmlns:cx2="http://schemas.microsoft.com/office/drawing/2015/10/21/chartex" xmlns:cx3="http://schemas.microsoft.com/office/drawing/2016/5/9/chartex" xmlns:cx4="http://schemas.microsoft.com/office/drawing/2016/5/10/chartex" xmlns:cx5="http://schemas.microsoft.com/office/drawing/2016/5/11/chartex" xmlns:cx6="http://schemas.microsoft.com/office/drawing/2016/5/12/chartex" xmlns:cx7="http://schemas.microsoft.com/office/drawing/2016/5/13/chartex" xmlns:cx8="http://schemas.microsoft.com/office/drawing/2016/5/14/chartex" xmlns:mc="http://schemas.openxmlformats.org/markup-compatibility/2006" xmlns:aink="http://schemas.microsoft.com/office/drawing/2016/ink" xmlns:am3d="http://schemas.microsoft.com/office/drawing/2017/model3d" xmlns:o="urn:schemas-microsoft-com:office:office" xmlns:r="http://schemas.openxmlformats.org/officeDocument/2006/relationships" xmlns:m="http://schemas.openxmlformats.org/officeDocument/2006/math" xmlns:v="urn:schemas-microsoft-com:vml" xmlns:wp14="http://schemas.microsoft.com/office/word/2010/wordprocessingDrawing" xmlns:wp="http://schemas.openxmlformats.org/drawingml/2006/wordprocessingDrawing" xmlns:w10="urn:schemas-microsoft-com:office:word" xmlns:w="http://schemas.openxmlformats.org/wordprocessingml/2006/main" xmlns:w14="http://schemas.microsoft.com/office/word/2010/wordml" xmlns:w15="http://schemas.microsoft.com/office/word/2012/wordml" xmlns:w16cid="http://schemas.microsoft.com/office/word/2016/wordml/cid" xmlns:w16se="http://schemas.microsoft.com/office/word/2015/wordml/symex" xmlns:wpg="http://schemas.microsoft.com/office/word/2010/wordprocessingGroup" xmlns:wpi="http://schemas.microsoft.com/office/word/2010/wordprocessingInk" xmlns:wne="http://schemas.microsoft.com/office/word/2006/wordml" xmlns:wps="http://schemas.microsoft.com/office/word/2010/wordprocessingShape" mc:Ignorable="w14 w15 w16se w16cid wp14">
   <w:body>
     <w:p>
       <w:pPr>
@@ -290,6 +290,27 @@
       <w:r>
         <w:t xml:space="preserve">Titre ou Fonction : </w:t>
       </w:r>
+      <w:proofErr w:type="spellStart"/>
+      <w:r>
+        <w:t>Sofware</w:t>
+      </w:r>
+      <w:proofErr w:type="spellEnd"/>
+      <w:r>
+        <w:t xml:space="preserve"> </w:t>
+      </w:r>
+      <w:proofErr w:type="spellStart"/>
+      <w:r>
+        <w:t>engineer</w:t>
+      </w:r>
+      <w:proofErr w:type="spellEnd"/>
+      <w:r>
+        <w:t xml:space="preserve"> / DevOps </w:t>
+      </w:r>
+      <w:proofErr w:type="spellStart"/>
+      <w:r>
+        <w:t>officer</w:t>
+      </w:r>
+      <w:proofErr w:type="spellEnd"/>
     </w:p>
     <w:p>
       <w:pPr>
@@ -310,6 +331,22 @@
         </w:rPr>
         <w:t>: +223 79 65 24 76</w:t>
       </w:r>
+      <w:r>
+        <w:rPr>
+          <w:rFonts w:cs="Arial"/>
+          <w:szCs w:val="24"/>
+        </w:rPr>
+        <w:t xml:space="preserve"> / </w:t>
+      </w:r>
+      <w:r>
+        <w:rPr>
+          <w:rFonts w:cs="Arial"/>
+          <w:szCs w:val="24"/>
+        </w:rPr>
+        <w:t>mouhamoud.dembele@hotmail.com</w:t>
+      </w:r>
+      <w:bookmarkStart w:id="0" w:name="_GoBack"/>
+      <w:bookmarkEnd w:id="0"/>
     </w:p>
     <w:p>
       <w:pPr>
@@ -881,7 +918,7 @@
 </file>
 
 <file path=word/endnotes.xml><?xml version="1.0" encoding="utf-8"?>
-<w:endnotes xmlns:wpc="http://schemas.microsoft.com/office/word/2010/wordprocessingCanvas" xmlns:cx="http://schemas.microsoft.com/office/drawing/2014/chartex" xmlns:cx1="http://schemas.microsoft.com/office/drawing/2015/9/8/chartex" xmlns:cx2="http://schemas.microsoft.com/office/drawing/2015/10/21/chartex" xmlns:cx3="http://schemas.microsoft.com/office/drawing/2016/5/9/chartex" xmlns:cx4="http://schemas.microsoft.com/office/drawing/2016/5/10/chartex" xmlns:cx5="http://schemas.microsoft.com/office/drawing/2016/5/11/chartex" xmlns:cx6="http://schemas.microsoft.com/office/drawing/2016/5/12/chartex" xmlns:cx7="http://schemas.microsoft.com/office/drawing/2016/5/13/chartex" xmlns:cx8="http://schemas.microsoft.com/office/drawing/2016/5/14/chartex" xmlns:mc="http://schemas.openxmlformats.org/markup-compatibility/2006" xmlns:aink="http://schemas.microsoft.com/office/drawing/2016/ink" xmlns:am3d="http://schemas.microsoft.com/office/drawing/2017/model3d" xmlns:o="urn:schemas-microsoft-com:office:office" xmlns:oel="http://schemas.microsoft.com/office/2019/extlst" xmlns:r="http://schemas.openxmlformats.org/officeDocument/2006/relationships" xmlns:m="http://schemas.openxmlformats.org/officeDocument/2006/math" xmlns:v="urn:schemas-microsoft-com:vml" xmlns:wp14="http://schemas.microsoft.com/office/word/2010/wordprocessingDrawing" xmlns:wp="http://schemas.openxmlformats.org/drawingml/2006/wordprocessingDrawing" xmlns:w10="urn:schemas-microsoft-com:office:word" xmlns:w="http://schemas.openxmlformats.org/wordprocessingml/2006/main" xmlns:w14="http://schemas.microsoft.com/office/word/2010/wordml" xmlns:w15="http://schemas.microsoft.com/office/word/2012/wordml" xmlns:w16cex="http://schemas.microsoft.com/office/word/2018/wordml/cex" xmlns:w16cid="http://schemas.microsoft.com/office/word/2016/wordml/cid" xmlns:w16="http://schemas.microsoft.com/office/word/2018/wordml" xmlns:w16du="http://schemas.microsoft.com/office/word/2023/wordml/word16du" xmlns:w16sdtdh="http://schemas.microsoft.com/office/word/2020/wordml/sdtdatahash" xmlns:w16sdtfl="http://schemas.microsoft.com/office/word/2024/wordml/sdtformatlock" xmlns:w16se="http://schemas.microsoft.com/office/word/2015/wordml/symex" xmlns:wpg="http://schemas.microsoft.com/office/word/2010/wordprocessingGroup" xmlns:wpi="http://schemas.microsoft.com/office/word/2010/wordprocessingInk" xmlns:wne="http://schemas.microsoft.com/office/word/2006/wordml" xmlns:wps="http://schemas.microsoft.com/office/word/2010/wordprocessingShape" mc:Ignorable="w14 w15 w16se w16cid w16 w16cex w16sdtdh w16sdtfl w16du wp14">
+<w:endnotes xmlns:wpc="http://schemas.microsoft.com/office/word/2010/wordprocessingCanvas" xmlns:cx="http://schemas.microsoft.com/office/drawing/2014/chartex" xmlns:cx1="http://schemas.microsoft.com/office/drawing/2015/9/8/chartex" xmlns:cx2="http://schemas.microsoft.com/office/drawing/2015/10/21/chartex" xmlns:cx3="http://schemas.microsoft.com/office/drawing/2016/5/9/chartex" xmlns:cx4="http://schemas.microsoft.com/office/drawing/2016/5/10/chartex" xmlns:cx5="http://schemas.microsoft.com/office/drawing/2016/5/11/chartex" xmlns:cx6="http://schemas.microsoft.com/office/drawing/2016/5/12/chartex" xmlns:cx7="http://schemas.microsoft.com/office/drawing/2016/5/13/chartex" xmlns:cx8="http://schemas.microsoft.com/office/drawing/2016/5/14/chartex" xmlns:mc="http://schemas.openxmlformats.org/markup-compatibility/2006" xmlns:aink="http://schemas.microsoft.com/office/drawing/2016/ink" xmlns:am3d="http://schemas.microsoft.com/office/drawing/2017/model3d" xmlns:o="urn:schemas-microsoft-com:office:office" xmlns:r="http://schemas.openxmlformats.org/officeDocument/2006/relationships" xmlns:m="http://schemas.openxmlformats.org/officeDocument/2006/math" xmlns:v="urn:schemas-microsoft-com:vml" xmlns:wp14="http://schemas.microsoft.com/office/word/2010/wordprocessingDrawing" xmlns:wp="http://schemas.openxmlformats.org/drawingml/2006/wordprocessingDrawing" xmlns:w10="urn:schemas-microsoft-com:office:word" xmlns:w="http://schemas.openxmlformats.org/wordprocessingml/2006/main" xmlns:w14="http://schemas.microsoft.com/office/word/2010/wordml" xmlns:w15="http://schemas.microsoft.com/office/word/2012/wordml" xmlns:w16cid="http://schemas.microsoft.com/office/word/2016/wordml/cid" xmlns:w16se="http://schemas.microsoft.com/office/word/2015/wordml/symex" xmlns:wpg="http://schemas.microsoft.com/office/word/2010/wordprocessingGroup" xmlns:wpi="http://schemas.microsoft.com/office/word/2010/wordprocessingInk" xmlns:wne="http://schemas.microsoft.com/office/word/2006/wordml" xmlns:wps="http://schemas.microsoft.com/office/word/2010/wordprocessingShape" mc:Ignorable="w14 w15 w16se w16cid wp14">
   <w:endnote w:type="separator" w:id="-1">
     <w:p>
       <w:pPr>
@@ -906,7 +943,7 @@
 </file>
 
 <file path=word/footer1.xml><?xml version="1.0" encoding="utf-8"?>
-<w:ftr xmlns:wpc="http://schemas.microsoft.com/office/word/2010/wordprocessingCanvas" xmlns:cx="http://schemas.microsoft.com/office/drawing/2014/chartex" xmlns:cx1="http://schemas.microsoft.com/office/drawing/2015/9/8/chartex" xmlns:cx2="http://schemas.microsoft.com/office/drawing/2015/10/21/chartex" xmlns:cx3="http://schemas.microsoft.com/office/drawing/2016/5/9/chartex" xmlns:cx4="http://schemas.microsoft.com/office/drawing/2016/5/10/chartex" xmlns:cx5="http://schemas.microsoft.com/office/drawing/2016/5/11/chartex" xmlns:cx6="http://schemas.microsoft.com/office/drawing/2016/5/12/chartex" xmlns:cx7="http://schemas.microsoft.com/office/drawing/2016/5/13/chartex" xmlns:cx8="http://schemas.microsoft.com/office/drawing/2016/5/14/chartex" xmlns:mc="http://schemas.openxmlformats.org/markup-compatibility/2006" xmlns:aink="http://schemas.microsoft.com/office/drawing/2016/ink" xmlns:am3d="http://schemas.microsoft.com/office/drawing/2017/model3d" xmlns:o="urn:schemas-microsoft-com:office:office" xmlns:oel="http://schemas.microsoft.com/office/2019/extlst" xmlns:r="http://schemas.openxmlformats.org/officeDocument/2006/relationships" xmlns:m="http://schemas.openxmlformats.org/officeDocument/2006/math" xmlns:v="urn:schemas-microsoft-com:vml" xmlns:wp14="http://schemas.microsoft.com/office/word/2010/wordprocessingDrawing" xmlns:wp="http://schemas.openxmlformats.org/drawingml/2006/wordprocessingDrawing" xmlns:w10="urn:schemas-microsoft-com:office:word" xmlns:w="http://schemas.openxmlformats.org/wordprocessingml/2006/main" xmlns:w14="http://schemas.microsoft.com/office/word/2010/wordml" xmlns:w15="http://schemas.microsoft.com/office/word/2012/wordml" xmlns:w16cex="http://schemas.microsoft.com/office/word/2018/wordml/cex" xmlns:w16cid="http://schemas.microsoft.com/office/word/2016/wordml/cid" xmlns:w16="http://schemas.microsoft.com/office/word/2018/wordml" xmlns:w16du="http://schemas.microsoft.com/office/word/2023/wordml/word16du" xmlns:w16sdtdh="http://schemas.microsoft.com/office/word/2020/wordml/sdtdatahash" xmlns:w16sdtfl="http://schemas.microsoft.com/office/word/2024/wordml/sdtformatlock" xmlns:w16se="http://schemas.microsoft.com/office/word/2015/wordml/symex" xmlns:wpg="http://schemas.microsoft.com/office/word/2010/wordprocessingGroup" xmlns:wpi="http://schemas.microsoft.com/office/word/2010/wordprocessingInk" xmlns:wne="http://schemas.microsoft.com/office/word/2006/wordml" xmlns:wps="http://schemas.microsoft.com/office/word/2010/wordprocessingShape" mc:Ignorable="w14 w15 w16se w16cid w16 w16cex w16sdtdh w16sdtfl w16du wp14">
+<w:ftr xmlns:wpc="http://schemas.microsoft.com/office/word/2010/wordprocessingCanvas" xmlns:cx="http://schemas.microsoft.com/office/drawing/2014/chartex" xmlns:cx1="http://schemas.microsoft.com/office/drawing/2015/9/8/chartex" xmlns:cx2="http://schemas.microsoft.com/office/drawing/2015/10/21/chartex" xmlns:cx3="http://schemas.microsoft.com/office/drawing/2016/5/9/chartex" xmlns:cx4="http://schemas.microsoft.com/office/drawing/2016/5/10/chartex" xmlns:cx5="http://schemas.microsoft.com/office/drawing/2016/5/11/chartex" xmlns:cx6="http://schemas.microsoft.com/office/drawing/2016/5/12/chartex" xmlns:cx7="http://schemas.microsoft.com/office/drawing/2016/5/13/chartex" xmlns:cx8="http://schemas.microsoft.com/office/drawing/2016/5/14/chartex" xmlns:mc="http://schemas.openxmlformats.org/markup-compatibility/2006" xmlns:aink="http://schemas.microsoft.com/office/drawing/2016/ink" xmlns:am3d="http://schemas.microsoft.com/office/drawing/2017/model3d" xmlns:o="urn:schemas-microsoft-com:office:office" xmlns:r="http://schemas.openxmlformats.org/officeDocument/2006/relationships" xmlns:m="http://schemas.openxmlformats.org/officeDocument/2006/math" xmlns:v="urn:schemas-microsoft-com:vml" xmlns:wp14="http://schemas.microsoft.com/office/word/2010/wordprocessingDrawing" xmlns:wp="http://schemas.openxmlformats.org/drawingml/2006/wordprocessingDrawing" xmlns:w10="urn:schemas-microsoft-com:office:word" xmlns:w="http://schemas.openxmlformats.org/wordprocessingml/2006/main" xmlns:w14="http://schemas.microsoft.com/office/word/2010/wordml" xmlns:w15="http://schemas.microsoft.com/office/word/2012/wordml" xmlns:w16cid="http://schemas.microsoft.com/office/word/2016/wordml/cid" xmlns:w16se="http://schemas.microsoft.com/office/word/2015/wordml/symex" xmlns:wpg="http://schemas.microsoft.com/office/word/2010/wordprocessingGroup" xmlns:wpi="http://schemas.microsoft.com/office/word/2010/wordprocessingInk" xmlns:wne="http://schemas.microsoft.com/office/word/2006/wordml" xmlns:wps="http://schemas.microsoft.com/office/word/2010/wordprocessingShape" mc:Ignorable="w14 w15 w16se w16cid wp14">
   <w:p>
     <w:pPr>
       <w:spacing w:after="0" w:line="259" w:lineRule="auto"/>
@@ -1015,7 +1052,7 @@
 </file>
 
 <file path=word/footnotes.xml><?xml version="1.0" encoding="utf-8"?>
-<w:footnotes xmlns:wpc="http://schemas.microsoft.com/office/word/2010/wordprocessingCanvas" xmlns:cx="http://schemas.microsoft.com/office/drawing/2014/chartex" xmlns:cx1="http://schemas.microsoft.com/office/drawing/2015/9/8/chartex" xmlns:cx2="http://schemas.microsoft.com/office/drawing/2015/10/21/chartex" xmlns:cx3="http://schemas.microsoft.com/office/drawing/2016/5/9/chartex" xmlns:cx4="http://schemas.microsoft.com/office/drawing/2016/5/10/chartex" xmlns:cx5="http://schemas.microsoft.com/office/drawing/2016/5/11/chartex" xmlns:cx6="http://schemas.microsoft.com/office/drawing/2016/5/12/chartex" xmlns:cx7="http://schemas.microsoft.com/office/drawing/2016/5/13/chartex" xmlns:cx8="http://schemas.microsoft.com/office/drawing/2016/5/14/chartex" xmlns:mc="http://schemas.openxmlformats.org/markup-compatibility/2006" xmlns:aink="http://schemas.microsoft.com/office/drawing/2016/ink" xmlns:am3d="http://schemas.microsoft.com/office/drawing/2017/model3d" xmlns:o="urn:schemas-microsoft-com:office:office" xmlns:oel="http://schemas.microsoft.com/office/2019/extlst" xmlns:r="http://schemas.openxmlformats.org/officeDocument/2006/relationships" xmlns:m="http://schemas.openxmlformats.org/officeDocument/2006/math" xmlns:v="urn:schemas-microsoft-com:vml" xmlns:wp14="http://schemas.microsoft.com/office/word/2010/wordprocessingDrawing" xmlns:wp="http://schemas.openxmlformats.org/drawingml/2006/wordprocessingDrawing" xmlns:w10="urn:schemas-microsoft-com:office:word" xmlns:w="http://schemas.openxmlformats.org/wordprocessingml/2006/main" xmlns:w14="http://schemas.microsoft.com/office/word/2010/wordml" xmlns:w15="http://schemas.microsoft.com/office/word/2012/wordml" xmlns:w16cex="http://schemas.microsoft.com/office/word/2018/wordml/cex" xmlns:w16cid="http://schemas.microsoft.com/office/word/2016/wordml/cid" xmlns:w16="http://schemas.microsoft.com/office/word/2018/wordml" xmlns:w16du="http://schemas.microsoft.com/office/word/2023/wordml/word16du" xmlns:w16sdtdh="http://schemas.microsoft.com/office/word/2020/wordml/sdtdatahash" xmlns:w16sdtfl="http://schemas.microsoft.com/office/word/2024/wordml/sdtformatlock" xmlns:w16se="http://schemas.microsoft.com/office/word/2015/wordml/symex" xmlns:wpg="http://schemas.microsoft.com/office/word/2010/wordprocessingGroup" xmlns:wpi="http://schemas.microsoft.com/office/word/2010/wordprocessingInk" xmlns:wne="http://schemas.microsoft.com/office/word/2006/wordml" xmlns:wps="http://schemas.microsoft.com/office/word/2010/wordprocessingShape" mc:Ignorable="w14 w15 w16se w16cid w16 w16cex w16sdtdh w16sdtfl w16du wp14">
+<w:footnotes xmlns:wpc="http://schemas.microsoft.com/office/word/2010/wordprocessingCanvas" xmlns:cx="http://schemas.microsoft.com/office/drawing/2014/chartex" xmlns:cx1="http://schemas.microsoft.com/office/drawing/2015/9/8/chartex" xmlns:cx2="http://schemas.microsoft.com/office/drawing/2015/10/21/chartex" xmlns:cx3="http://schemas.microsoft.com/office/drawing/2016/5/9/chartex" xmlns:cx4="http://schemas.microsoft.com/office/drawing/2016/5/10/chartex" xmlns:cx5="http://schemas.microsoft.com/office/drawing/2016/5/11/chartex" xmlns:cx6="http://schemas.microsoft.com/office/drawing/2016/5/12/chartex" xmlns:cx7="http://schemas.microsoft.com/office/drawing/2016/5/13/chartex" xmlns:cx8="http://schemas.microsoft.com/office/drawing/2016/5/14/chartex" xmlns:mc="http://schemas.openxmlformats.org/markup-compatibility/2006" xmlns:aink="http://schemas.microsoft.com/office/drawing/2016/ink" xmlns:am3d="http://schemas.microsoft.com/office/drawing/2017/model3d" xmlns:o="urn:schemas-microsoft-com:office:office" xmlns:r="http://schemas.openxmlformats.org/officeDocument/2006/relationships" xmlns:m="http://schemas.openxmlformats.org/officeDocument/2006/math" xmlns:v="urn:schemas-microsoft-com:vml" xmlns:wp14="http://schemas.microsoft.com/office/word/2010/wordprocessingDrawing" xmlns:wp="http://schemas.openxmlformats.org/drawingml/2006/wordprocessingDrawing" xmlns:w10="urn:schemas-microsoft-com:office:word" xmlns:w="http://schemas.openxmlformats.org/wordprocessingml/2006/main" xmlns:w14="http://schemas.microsoft.com/office/word/2010/wordml" xmlns:w15="http://schemas.microsoft.com/office/word/2012/wordml" xmlns:w16cid="http://schemas.microsoft.com/office/word/2016/wordml/cid" xmlns:w16se="http://schemas.microsoft.com/office/word/2015/wordml/symex" xmlns:wpg="http://schemas.microsoft.com/office/word/2010/wordprocessingGroup" xmlns:wpi="http://schemas.microsoft.com/office/word/2010/wordprocessingInk" xmlns:wne="http://schemas.microsoft.com/office/word/2006/wordml" xmlns:wps="http://schemas.microsoft.com/office/word/2010/wordprocessingShape" mc:Ignorable="w14 w15 w16se w16cid wp14">
   <w:footnote w:type="separator" w:id="-1">
     <w:p>
       <w:pPr>
@@ -1040,7 +1077,7 @@
 </file>
 
 <file path=word/styles.xml><?xml version="1.0" encoding="utf-8"?>
-<w:styles xmlns:mc="http://schemas.openxmlformats.org/markup-compatibility/2006" xmlns:r="http://schemas.openxmlformats.org/officeDocument/2006/relationships" xmlns:w="http://schemas.openxmlformats.org/wordprocessingml/2006/main" xmlns:w14="http://schemas.microsoft.com/office/word/2010/wordml" xmlns:w15="http://schemas.microsoft.com/office/word/2012/wordml" xmlns:w16cex="http://schemas.microsoft.com/office/word/2018/wordml/cex" xmlns:w16cid="http://schemas.microsoft.com/office/word/2016/wordml/cid" xmlns:w16="http://schemas.microsoft.com/office/word/2018/wordml" xmlns:w16du="http://schemas.microsoft.com/office/word/2023/wordml/word16du" xmlns:w16sdtdh="http://schemas.microsoft.com/office/word/2020/wordml/sdtdatahash" xmlns:w16sdtfl="http://schemas.microsoft.com/office/word/2024/wordml/sdtformatlock" xmlns:w16se="http://schemas.microsoft.com/office/word/2015/wordml/symex" mc:Ignorable="w14 w15 w16se w16cid w16 w16cex w16sdtdh w16sdtfl w16du">
+<w:styles xmlns:mc="http://schemas.openxmlformats.org/markup-compatibility/2006" xmlns:r="http://schemas.openxmlformats.org/officeDocument/2006/relationships" xmlns:w="http://schemas.openxmlformats.org/wordprocessingml/2006/main" xmlns:w14="http://schemas.microsoft.com/office/word/2010/wordml" xmlns:w15="http://schemas.microsoft.com/office/word/2012/wordml" xmlns:w16cid="http://schemas.microsoft.com/office/word/2016/wordml/cid" xmlns:w16se="http://schemas.microsoft.com/office/word/2015/wordml/symex" mc:Ignorable="w14 w15 w16se w16cid">
   <w:docDefaults>
     <w:rPrDefault>
       <w:rPr>
@@ -1056,7 +1093,7 @@
       </w:pPr>
     </w:pPrDefault>
   </w:docDefaults>
-  <w:latentStyles w:defLockedState="0" w:defUIPriority="99" w:defSemiHidden="0" w:defUnhideWhenUsed="0" w:defQFormat="0" w:count="376">
+  <w:latentStyles w:defLockedState="0" w:defUIPriority="99" w:defSemiHidden="0" w:defUnhideWhenUsed="0" w:defQFormat="0" w:count="375">
     <w:lsdException w:name="Normal" w:uiPriority="0" w:qFormat="1"/>
     <w:lsdException w:name="heading 1" w:uiPriority="9" w:qFormat="1"/>
     <w:lsdException w:name="heading 2" w:semiHidden="1" w:uiPriority="9" w:unhideWhenUsed="1" w:qFormat="1"/>
@@ -1432,7 +1469,6 @@
     <w:lsdException w:name="Smart Hyperlink" w:semiHidden="1" w:unhideWhenUsed="1"/>
     <w:lsdException w:name="Hashtag" w:semiHidden="1" w:unhideWhenUsed="1"/>
     <w:lsdException w:name="Unresolved Mention" w:semiHidden="1" w:unhideWhenUsed="1"/>
-    <w:lsdException w:name="Smart Link" w:semiHidden="1" w:unhideWhenUsed="1"/>
   </w:latentStyles>
   <w:style w:type="paragraph" w:default="1" w:styleId="Normal">
     <w:name w:val="Normal"/>

</xml_diff>